<commit_message>
feat(gpio): HPHEAT input on J3.3; label regenerated; H plugs read GND-DATA-VCC from the front
The heat-pump changeover relay is built: its coil is the HZ-432's B terminal,
energised on a heat-pump heating call, and it steers the CHIL dry contact
between the Chiltrix's cooling and heating pairs. Its spare pole lands on the
I/O board's J3.3 (BCM 24) and publishes as HPHEAT, so the dashboards can tell
which source is heating; the Relays panel gains the series. The relay takes
the same name as the signal.

The label is regenerated for everything since the cutover print: SCALA on J3.2,
HPHEAT on J3.3, and the H sockets written as GND-DATA-VCC because the board
hangs vertically under the Pi with its solder side out, so the front view is
the socket's V/D/G pin order reversed. The docs that carry the roster and the
plug order say the same.

Co-Authored-By: Claude Sonnet 4.6 <noreply@anthropic.com>
</commit_message>
<xml_diff>
--- a/docs/PhoenixContact-BC-RPI-label.docx
+++ b/docs/PhoenixContact-BC-RPI-label.docx
@@ -464,7 +464,7 @@
                 <w:sz w:val="18"/>
                 <w:szCs w:val="18"/>
               </w:rPr>
-              <w:t xml:space="preserve">J3.2  SP-A</w:t>
+              <w:t xml:space="preserve">J3.2  SCALA</w:t>
             </w:r>
             <w:r>
               <w:rPr>
@@ -513,7 +513,7 @@
                 <w:sz w:val="18"/>
                 <w:szCs w:val="18"/>
               </w:rPr>
-              <w:t xml:space="preserve">J3.3  SP-B</w:t>
+              <w:t xml:space="preserve">J3.3  HPHEAT</w:t>
             </w:r>
             <w:r>
               <w:rPr>
@@ -800,77 +800,112 @@
                 <w:sz w:val="18"/>
                 <w:szCs w:val="18"/>
               </w:rPr>
-              <w:t xml:space="preserve">H1  VCC·DATA·GND  trunk</w:t>
-            </w:r>
-          </w:p>
-        </w:tc>
-      </w:tr>
-      <w:tr>
-        <w:tblPrEx>
-          <w:tblCellMar>
-            <w:top w:w="0" w:type="dxa"/>
-            <w:bottom w:w="0" w:type="dxa"/>
-          </w:tblCellMar>
-        </w:tblPrEx>
-        <w:trPr>
-          <w:trHeight w:val="144"/>
-        </w:trPr>
-        <w:tc>
-          <w:tcPr>
-            <w:tcW w:w="2158" w:type="dxa"/>
-            <w:gridSpan w:val="2"/>
-          </w:tcPr>
-          <w:p>
-            <w:pPr>
-              <w:tabs>
-                <w:tab w:val="right" w:pos="1980"/>
-              </w:tabs>
-              <w:rPr>
-                <w:sz w:val="18"/>
-                <w:szCs w:val="18"/>
-              </w:rPr>
-            </w:pPr>
-            <w:r>
-              <w:rPr>
-                <w:sz w:val="18"/>
-                <w:szCs w:val="18"/>
-              </w:rPr>
-              <w:t xml:space="preserve">H2  VCC·DATA·GND  spare</w:t>
-            </w:r>
-          </w:p>
-        </w:tc>
-      </w:tr>
-      <w:tr>
-        <w:tblPrEx>
-          <w:tblCellMar>
-            <w:top w:w="0" w:type="dxa"/>
-            <w:bottom w:w="0" w:type="dxa"/>
-          </w:tblCellMar>
-        </w:tblPrEx>
-        <w:trPr>
-          <w:trHeight w:val="144"/>
-        </w:trPr>
-        <w:tc>
-          <w:tcPr>
-            <w:tcW w:w="2158" w:type="dxa"/>
-            <w:gridSpan w:val="2"/>
-          </w:tcPr>
-          <w:p>
-            <w:pPr>
-              <w:tabs>
-                <w:tab w:val="right" w:pos="1980"/>
-              </w:tabs>
-              <w:rPr>
-                <w:sz w:val="18"/>
-                <w:szCs w:val="18"/>
-              </w:rPr>
-            </w:pPr>
-            <w:r>
-              <w:rPr>
-                <w:sz w:val="18"/>
-                <w:szCs w:val="18"/>
-              </w:rPr>
-              <w:t xml:space="preserve">H3  VCC·DATA·GND  spare</w:t>
+              <w:t xml:space="preserve">H1  GND·DATA·VCC  trunk</w:t>
+            </w:r>
+          </w:p>
+        </w:tc>
+      </w:tr>
+      <w:tr>
+        <w:tblPrEx>
+          <w:tblCellMar>
+            <w:top w:w="0" w:type="dxa"/>
+            <w:bottom w:w="0" w:type="dxa"/>
+          </w:tblCellMar>
+        </w:tblPrEx>
+        <w:trPr>
+          <w:trHeight w:val="144"/>
+        </w:trPr>
+        <w:tc>
+          <w:tcPr>
+            <w:tcW w:w="2158" w:type="dxa"/>
+            <w:gridSpan w:val="2"/>
+          </w:tcPr>
+          <w:p>
+            <w:pPr>
+              <w:tabs>
+                <w:tab w:val="right" w:pos="1980"/>
+              </w:tabs>
+              <w:rPr>
+                <w:sz w:val="18"/>
+                <w:szCs w:val="18"/>
+              </w:rPr>
+            </w:pPr>
+            <w:r>
+              <w:rPr>
+                <w:sz w:val="18"/>
+                <w:szCs w:val="18"/>
+              </w:rPr>
+              <w:t xml:space="preserve">H2  GND·DATA·VCC  spare</w:t>
+            </w:r>
+          </w:p>
+        </w:tc>
+      </w:tr>
+      <w:tr>
+        <w:tblPrEx>
+          <w:tblCellMar>
+            <w:top w:w="0" w:type="dxa"/>
+            <w:bottom w:w="0" w:type="dxa"/>
+          </w:tblCellMar>
+        </w:tblPrEx>
+        <w:trPr>
+          <w:trHeight w:val="144"/>
+        </w:trPr>
+        <w:tc>
+          <w:tcPr>
+            <w:tcW w:w="2158" w:type="dxa"/>
+            <w:gridSpan w:val="2"/>
+          </w:tcPr>
+          <w:p>
+            <w:pPr>
+              <w:tabs>
+                <w:tab w:val="right" w:pos="1980"/>
+              </w:tabs>
+              <w:rPr>
+                <w:sz w:val="18"/>
+                <w:szCs w:val="18"/>
+              </w:rPr>
+            </w:pPr>
+            <w:r>
+              <w:rPr>
+                <w:sz w:val="18"/>
+                <w:szCs w:val="18"/>
+              </w:rPr>
+              <w:t xml:space="preserve">H3  GND·DATA·VCC  spare</w:t>
+            </w:r>
+          </w:p>
+        </w:tc>
+      </w:tr>
+      <w:tr>
+        <w:tblPrEx>
+          <w:tblCellMar>
+            <w:top w:w="0" w:type="dxa"/>
+            <w:bottom w:w="0" w:type="dxa"/>
+          </w:tblCellMar>
+        </w:tblPrEx>
+        <w:trPr>
+          <w:trHeight w:val="144"/>
+        </w:trPr>
+        <w:tc>
+          <w:tcPr>
+            <w:tcW w:w="2158" w:type="dxa"/>
+            <w:gridSpan w:val="2"/>
+          </w:tcPr>
+          <w:p>
+            <w:pPr>
+              <w:tabs>
+                <w:tab w:val="right" w:pos="1980"/>
+              </w:tabs>
+              <w:rPr>
+                <w:sz w:val="18"/>
+                <w:szCs w:val="18"/>
+              </w:rPr>
+            </w:pPr>
+            <w:r>
+              <w:rPr>
+                <w:sz w:val="18"/>
+                <w:szCs w:val="18"/>
+              </w:rPr>
+              <w:t xml:space="preserve">H order is the front view, solder side out</w:t>
             </w:r>
           </w:p>
         </w:tc>

</xml_diff>